<commit_message>
Update brosur: lengkapi harga dan koreksi durasi paket 2 jadi 2 hari
</commit_message>
<xml_diff>
--- a/Brosur_Pelatihan_PPBIB.docx
+++ b/Brosur_Pelatihan_PPBIB.docx
@@ -282,7 +282,7 @@
                 <w:color w:val="1B5E20"/>
                 <w:sz w:val="20"/>
               </w:rPr>
-              <w:t>Hubungi Kami</w:t>
+              <w:t>Rp 3.250.000</w:t>
             </w:r>
           </w:p>
         </w:tc>
@@ -599,7 +599,7 @@
                 <w:color w:val="0D47A1"/>
                 <w:sz w:val="20"/>
               </w:rPr>
-              <w:t>3 Hari</w:t>
+              <w:t>2 Hari</w:t>
             </w:r>
           </w:p>
         </w:tc>
@@ -637,7 +637,7 @@
                 <w:color w:val="0D47A1"/>
                 <w:sz w:val="20"/>
               </w:rPr>
-              <w:t>Hubungi Kami</w:t>
+              <w:t>Rp 3.000.000</w:t>
             </w:r>
           </w:p>
         </w:tc>
@@ -1011,7 +1011,7 @@
                 <w:color w:val="880E4F"/>
                 <w:sz w:val="20"/>
               </w:rPr>
-              <w:t>Hubungi Kami</w:t>
+              <w:t>Rp 3.250.000</w:t>
             </w:r>
           </w:p>
         </w:tc>

</xml_diff>

<commit_message>
Update brosur: sesuaikan keterangan placeholder foto dokumentasi
</commit_message>
<xml_diff>
--- a/Brosur_Pelatihan_PPBIB.docx
+++ b/Brosur_Pelatihan_PPBIB.docx
@@ -1438,7 +1438,9 @@
                 <w:color w:val="AAAAAA"/>
                 <w:sz w:val="18"/>
               </w:rPr>
-              <w:t>[ Foto Kegiatan 1 ]</w:t>
+              <w:t>[ Foto: Praktik Mesin</w:t>
+              <w:br/>
+              <w:t>Pembuatan Pakan Ikan ]</w:t>
             </w:r>
           </w:p>
         </w:tc>
@@ -1458,7 +1460,9 @@
                 <w:color w:val="AAAAAA"/>
                 <w:sz w:val="18"/>
               </w:rPr>
-              <w:t>[ Foto Kegiatan 2 ]</w:t>
+              <w:t>[ Foto: Sesi Kelas</w:t>
+              <w:br/>
+              <w:t>Teori &amp; Diskusi ]</w:t>
             </w:r>
           </w:p>
         </w:tc>
@@ -1478,7 +1482,9 @@
                 <w:color w:val="AAAAAA"/>
                 <w:sz w:val="18"/>
               </w:rPr>
-              <w:t>[ Foto Kegiatan 3 ]</w:t>
+              <w:t>[ Foto: Praktik Langsung</w:t>
+              <w:br/>
+              <w:t>di Kolam Budidaya ]</w:t>
             </w:r>
           </w:p>
         </w:tc>

</xml_diff>